<commit_message>
feat: izin kamera hp, persistent data keuangan
</commit_message>
<xml_diff>
--- a/Dokumentasi_Project_AturAja.docx
+++ b/Dokumentasi_Project_AturAja.docx
@@ -746,7 +746,7 @@
           </w:tcPr>
           <w:p>
             <w:r>
-              <w:t>Halaman pemindai kuitansi/struk belanja menggunakan kamera device.</w:t>
+              <w:t>Halaman pemindai kuitansi/struk belanja dengan preview kamera langsung di dalam aplikasi.</w:t>
             </w:r>
           </w:p>
         </w:tc>
@@ -4524,7 +4524,7 @@
         <w:t xml:space="preserve">● </w:t>
       </w:r>
       <w:r>
-        <w:t>Penyimpanan data masih berbasis in-memory/simulasi lokal (belum terhubung ke database cloud Firebase/REST API).</w:t>
+        <w:t>Data tugas, transaksi, profil, pengaturan, tema, dan sesi login disimpan lokal melalui SharedPreferences; belum terhubung ke database cloud Firebase/REST API.</w:t>
       </w:r>
     </w:p>
     <w:p>
@@ -4539,7 +4539,7 @@
         <w:t xml:space="preserve">● </w:t>
       </w:r>
       <w:r>
-        <w:t>Data riset akan kembali ke kondisi data sampel default jika aplikasi di-restart total.</w:t>
+        <w:t>Cadangan cloud, notifikasi, biometrik, dan OCR struk masih berupa simulasi.</w:t>
       </w:r>
     </w:p>
     <w:p>

</xml_diff>